<commit_message>
docs(phase-1): correct T4 Fallback vs manual Antigravity description in router info
</commit_message>
<xml_diff>
--- a/reports/SLAS_Manuscript_Draft.docx
+++ b/reports/SLAS_Manuscript_Draft.docx
@@ -1310,7 +1310,7 @@
           <w:color w:val="2B2B2B"/>
           <w:sz w:val="22"/>
         </w:rPr>
-        <w:t>). Reserved for complex architectural reasoning and manuscript generation.</w:t>
+        <w:t>). Reserved for complex architectural and GNN reasoning tasks.</w:t>
       </w:r>
     </w:p>
     <w:p>
@@ -1325,7 +1325,7 @@
           <w:color w:val="2B2B2B"/>
           <w:sz w:val="22"/>
         </w:rPr>
-        <w:t>Tier 4 (Antigravity - Claude Proxy):</w:t>
+        <w:t>Tier 4 (Fallback - Automated):</w:t>
       </w:r>
       <w:r>
         <w:rPr>
@@ -1333,7 +1333,7 @@
           <w:color w:val="2B2B2B"/>
           <w:sz w:val="22"/>
         </w:rPr>
-        <w:t xml:space="preserve"> Routes queries to Claude Sonnet/Opus through a secure proxy (</w:t>
+        <w:t xml:space="preserve"> Mapped to local Claude Sonnet/Opus proxy (</w:t>
       </w:r>
       <w:r>
         <w:rPr>
@@ -1349,7 +1349,46 @@
           <w:color w:val="2B2B2B"/>
           <w:sz w:val="22"/>
         </w:rPr>
-        <w:t>) for high-level manuscript drafting and PhD SOP generation, protected by a weekly token limit and local caching.</w:t>
+        <w:t>). Serves as a final fallback triggered automatically if T1/T2/T3 fails in the pipeline execution loop.</w:t>
+      </w:r>
+    </w:p>
+    <w:p>
+      <w:pPr>
+        <w:pStyle w:val="ListBullet"/>
+        <w:spacing w:before="0" w:after="60" w:line="276" w:lineRule="auto"/>
+      </w:pPr>
+      <w:r>
+        <w:rPr>
+          <w:rFonts w:ascii="Calibri" w:hAnsi="Calibri"/>
+          <w:b/>
+          <w:color w:val="2B2B2B"/>
+          <w:sz w:val="22"/>
+        </w:rPr>
+        <w:t>Antigravity (Manual - Preferred):</w:t>
+      </w:r>
+      <w:r>
+        <w:rPr>
+          <w:rFonts w:ascii="Calibri" w:hAnsi="Calibri"/>
+          <w:color w:val="2B2B2B"/>
+          <w:sz w:val="22"/>
+        </w:rPr>
+        <w:t xml:space="preserve"> Mapped to Claude Sonnet/Opus proxy (</w:t>
+      </w:r>
+      <w:r>
+        <w:rPr>
+          <w:rFonts w:ascii="Consolas" w:hAnsi="Consolas"/>
+          <w:color w:val="9E2A2B"/>
+          <w:sz w:val="20"/>
+        </w:rPr>
+        <w:t>localhost:8080</w:t>
+      </w:r>
+      <w:r>
+        <w:rPr>
+          <w:rFonts w:ascii="Calibri" w:hAnsi="Calibri"/>
+          <w:color w:val="2B2B2B"/>
+          <w:sz w:val="22"/>
+        </w:rPr>
+        <w:t>). Direct, preferred manual option used by the developer for long-form manuscript prose writing, PhD cover letters, and research statements.</w:t>
       </w:r>
     </w:p>
     <w:p>

</xml_diff>